<commit_message>
Replace remote data with local data
</commit_message>
<xml_diff>
--- a/data/numeric/input/data_472/各地区住房公积金2024年年度报告.docx
+++ b/data/numeric/input/data_472/各地区住房公积金2024年年度报告.docx
@@ -73,15 +73,12 @@
     </w:p>
     <w:p>
       <w:r>
-        <w:t>（一）缴存：2024年，新开户单位21483家，净增单位11748家；新开户职工70.3万人，净增职工7.9万人；实缴单位192687家，实缴职工396.9万人，缴存额1079.9亿元，分别同比增长6.5%、2.0%、5.9%。2024年末，缴存总额8440.0亿元，同比增长14.7%；缴存余额2280.5亿元，同比增长11.6%。受委托办理住房公积金缴存业务的银行5家，比上年增加一家（省直中心</w:t>
-      </w:r>
-      <w:proofErr w:type="gramStart"/>
-      <w:r>
-        <w:t>增加浙商银行</w:t>
-      </w:r>
-      <w:proofErr w:type="gramEnd"/>
-      <w:r>
-        <w:t>为归集银行）。</w:t>
+        <w:rPr/>
+        <w:t>（一）缴存：2024年，新开户单位21483家，净增单位11748家；新开户职工70.3万人，净增职工7.9万人；实缴单位192687家，实缴职工396.9万人，缴存额1079.9亿元，分别同比增长6.5%、2.0%、5.9%。2024年末，缴存总额8440.0亿元，同比增长14.7%；缴存余额2280.5亿元，同比增长11.6%。受委托办理住房公积金缴存业务的银行5家，比上年增加一家</w:t>
+      </w:r>
+      <w:r>
+        <w:rPr/>
+        <w:t>。</w:t>
       </w:r>
     </w:p>
     <w:p/>
@@ -250,7 +247,7 @@
       </w:r>
     </w:p>
     <w:sectPr>
-      <w:pgSz w:w="11906" w:h="16838"/>
+      <w:pgSz w:w="11906" w:h="16838" w:orient="portrait"/>
       <w:pgMar w:top="1440" w:right="1800" w:bottom="1440" w:left="1800" w:header="851" w:footer="992" w:gutter="0"/>
       <w:cols w:space="425"/>
       <w:docGrid w:type="lines" w:linePitch="312"/>
@@ -264,7 +261,7 @@
   <w:docDefaults>
     <w:rPrDefault>
       <w:rPr>
-        <w:rFonts w:asciiTheme="minorHAnsi" w:eastAsiaTheme="minorEastAsia" w:hAnsiTheme="minorHAnsi" w:cstheme="minorBidi"/>
+        <w:rFonts w:asciiTheme="minorHAnsi" w:hAnsiTheme="minorHAnsi" w:eastAsiaTheme="minorEastAsia" w:cstheme="minorBidi"/>
         <w:kern w:val="2"/>
         <w:sz w:val="22"/>
         <w:szCs w:val="24"/>
@@ -281,14 +278,14 @@
   <w:latentStyles w:defLockedState="0" w:defUIPriority="99" w:defSemiHidden="0" w:defUnhideWhenUsed="0" w:defQFormat="0" w:count="376">
     <w:lsdException w:name="Normal" w:uiPriority="0" w:qFormat="1"/>
     <w:lsdException w:name="heading 1" w:uiPriority="9" w:qFormat="1"/>
-    <w:lsdException w:name="heading 2" w:semiHidden="1" w:uiPriority="9" w:unhideWhenUsed="1" w:qFormat="1"/>
-    <w:lsdException w:name="heading 3" w:semiHidden="1" w:uiPriority="9" w:unhideWhenUsed="1" w:qFormat="1"/>
-    <w:lsdException w:name="heading 4" w:semiHidden="1" w:uiPriority="9" w:unhideWhenUsed="1" w:qFormat="1"/>
-    <w:lsdException w:name="heading 5" w:semiHidden="1" w:uiPriority="9" w:unhideWhenUsed="1" w:qFormat="1"/>
-    <w:lsdException w:name="heading 6" w:semiHidden="1" w:uiPriority="9" w:unhideWhenUsed="1" w:qFormat="1"/>
-    <w:lsdException w:name="heading 7" w:semiHidden="1" w:uiPriority="9" w:unhideWhenUsed="1" w:qFormat="1"/>
-    <w:lsdException w:name="heading 8" w:semiHidden="1" w:uiPriority="9" w:unhideWhenUsed="1" w:qFormat="1"/>
-    <w:lsdException w:name="heading 9" w:semiHidden="1" w:uiPriority="9" w:unhideWhenUsed="1" w:qFormat="1"/>
+    <w:lsdException w:name="heading 2" w:uiPriority="9" w:semiHidden="1" w:unhideWhenUsed="1" w:qFormat="1"/>
+    <w:lsdException w:name="heading 3" w:uiPriority="9" w:semiHidden="1" w:unhideWhenUsed="1" w:qFormat="1"/>
+    <w:lsdException w:name="heading 4" w:uiPriority="9" w:semiHidden="1" w:unhideWhenUsed="1" w:qFormat="1"/>
+    <w:lsdException w:name="heading 5" w:uiPriority="9" w:semiHidden="1" w:unhideWhenUsed="1" w:qFormat="1"/>
+    <w:lsdException w:name="heading 6" w:uiPriority="9" w:semiHidden="1" w:unhideWhenUsed="1" w:qFormat="1"/>
+    <w:lsdException w:name="heading 7" w:uiPriority="9" w:semiHidden="1" w:unhideWhenUsed="1" w:qFormat="1"/>
+    <w:lsdException w:name="heading 8" w:uiPriority="9" w:semiHidden="1" w:unhideWhenUsed="1" w:qFormat="1"/>
+    <w:lsdException w:name="heading 9" w:uiPriority="9" w:semiHidden="1" w:unhideWhenUsed="1" w:qFormat="1"/>
     <w:lsdException w:name="index 1" w:semiHidden="1" w:unhideWhenUsed="1"/>
     <w:lsdException w:name="index 2" w:semiHidden="1" w:unhideWhenUsed="1"/>
     <w:lsdException w:name="index 3" w:semiHidden="1" w:unhideWhenUsed="1"/>
@@ -298,22 +295,22 @@
     <w:lsdException w:name="index 7" w:semiHidden="1" w:unhideWhenUsed="1"/>
     <w:lsdException w:name="index 8" w:semiHidden="1" w:unhideWhenUsed="1"/>
     <w:lsdException w:name="index 9" w:semiHidden="1" w:unhideWhenUsed="1"/>
-    <w:lsdException w:name="toc 1" w:semiHidden="1" w:uiPriority="39" w:unhideWhenUsed="1"/>
-    <w:lsdException w:name="toc 2" w:semiHidden="1" w:uiPriority="39" w:unhideWhenUsed="1"/>
-    <w:lsdException w:name="toc 3" w:semiHidden="1" w:uiPriority="39" w:unhideWhenUsed="1"/>
-    <w:lsdException w:name="toc 4" w:semiHidden="1" w:uiPriority="39" w:unhideWhenUsed="1"/>
-    <w:lsdException w:name="toc 5" w:semiHidden="1" w:uiPriority="39" w:unhideWhenUsed="1"/>
-    <w:lsdException w:name="toc 6" w:semiHidden="1" w:uiPriority="39" w:unhideWhenUsed="1"/>
-    <w:lsdException w:name="toc 7" w:semiHidden="1" w:uiPriority="39" w:unhideWhenUsed="1"/>
-    <w:lsdException w:name="toc 8" w:semiHidden="1" w:uiPriority="39" w:unhideWhenUsed="1"/>
-    <w:lsdException w:name="toc 9" w:semiHidden="1" w:uiPriority="39" w:unhideWhenUsed="1"/>
+    <w:lsdException w:name="toc 1" w:uiPriority="39" w:semiHidden="1" w:unhideWhenUsed="1"/>
+    <w:lsdException w:name="toc 2" w:uiPriority="39" w:semiHidden="1" w:unhideWhenUsed="1"/>
+    <w:lsdException w:name="toc 3" w:uiPriority="39" w:semiHidden="1" w:unhideWhenUsed="1"/>
+    <w:lsdException w:name="toc 4" w:uiPriority="39" w:semiHidden="1" w:unhideWhenUsed="1"/>
+    <w:lsdException w:name="toc 5" w:uiPriority="39" w:semiHidden="1" w:unhideWhenUsed="1"/>
+    <w:lsdException w:name="toc 6" w:uiPriority="39" w:semiHidden="1" w:unhideWhenUsed="1"/>
+    <w:lsdException w:name="toc 7" w:uiPriority="39" w:semiHidden="1" w:unhideWhenUsed="1"/>
+    <w:lsdException w:name="toc 8" w:uiPriority="39" w:semiHidden="1" w:unhideWhenUsed="1"/>
+    <w:lsdException w:name="toc 9" w:uiPriority="39" w:semiHidden="1" w:unhideWhenUsed="1"/>
     <w:lsdException w:name="Normal Indent" w:semiHidden="1" w:unhideWhenUsed="1"/>
     <w:lsdException w:name="footnote text" w:semiHidden="1" w:unhideWhenUsed="1"/>
     <w:lsdException w:name="annotation text" w:semiHidden="1" w:unhideWhenUsed="1"/>
     <w:lsdException w:name="header" w:semiHidden="1" w:unhideWhenUsed="1"/>
     <w:lsdException w:name="footer" w:semiHidden="1" w:unhideWhenUsed="1"/>
     <w:lsdException w:name="index heading" w:semiHidden="1" w:unhideWhenUsed="1"/>
-    <w:lsdException w:name="caption" w:semiHidden="1" w:uiPriority="35" w:unhideWhenUsed="1" w:qFormat="1"/>
+    <w:lsdException w:name="caption" w:uiPriority="35" w:semiHidden="1" w:unhideWhenUsed="1" w:qFormat="1"/>
     <w:lsdException w:name="table of figures" w:semiHidden="1" w:unhideWhenUsed="1"/>
     <w:lsdException w:name="envelope address" w:semiHidden="1" w:unhideWhenUsed="1"/>
     <w:lsdException w:name="envelope return" w:semiHidden="1" w:unhideWhenUsed="1"/>
@@ -344,7 +341,7 @@
     <w:lsdException w:name="Title" w:uiPriority="10" w:qFormat="1"/>
     <w:lsdException w:name="Closing" w:semiHidden="1" w:unhideWhenUsed="1"/>
     <w:lsdException w:name="Signature" w:semiHidden="1" w:unhideWhenUsed="1"/>
-    <w:lsdException w:name="Default Paragraph Font" w:semiHidden="1" w:uiPriority="1" w:unhideWhenUsed="1"/>
+    <w:lsdException w:name="Default Paragraph Font" w:uiPriority="1" w:semiHidden="1" w:unhideWhenUsed="1"/>
     <w:lsdException w:name="Body Text" w:semiHidden="1" w:unhideWhenUsed="1"/>
     <w:lsdException w:name="Body Text Indent" w:semiHidden="1" w:unhideWhenUsed="1"/>
     <w:lsdException w:name="List Continue" w:semiHidden="1" w:unhideWhenUsed="1"/>
@@ -544,8 +541,8 @@
     <w:lsdException w:name="Subtle Reference" w:uiPriority="31" w:qFormat="1"/>
     <w:lsdException w:name="Intense Reference" w:uiPriority="32" w:qFormat="1"/>
     <w:lsdException w:name="Book Title" w:uiPriority="33" w:qFormat="1"/>
-    <w:lsdException w:name="Bibliography" w:semiHidden="1" w:uiPriority="37" w:unhideWhenUsed="1"/>
-    <w:lsdException w:name="TOC Heading" w:semiHidden="1" w:uiPriority="39" w:unhideWhenUsed="1" w:qFormat="1"/>
+    <w:lsdException w:name="Bibliography" w:uiPriority="37" w:semiHidden="1" w:unhideWhenUsed="1"/>
+    <w:lsdException w:name="TOC Heading" w:uiPriority="39" w:semiHidden="1" w:unhideWhenUsed="1" w:qFormat="1"/>
     <w:lsdException w:name="Plain Table 1" w:uiPriority="41"/>
     <w:lsdException w:name="Plain Table 2" w:uiPriority="42"/>
     <w:lsdException w:name="Plain Table 3" w:uiPriority="43"/>
@@ -656,7 +653,7 @@
     <w:lsdException w:name="Unresolved Mention" w:semiHidden="1" w:unhideWhenUsed="1"/>
     <w:lsdException w:name="Smart Link" w:semiHidden="1" w:unhideWhenUsed="1"/>
   </w:latentStyles>
-  <w:style w:type="paragraph" w:default="1" w:styleId="a">
+  <w:style w:type="paragraph" w:styleId="a" w:default="1">
     <w:name w:val="Normal"/>
     <w:qFormat/>
     <w:pPr>
@@ -678,7 +675,7 @@
       <w:outlineLvl w:val="0"/>
     </w:pPr>
     <w:rPr>
-      <w:rFonts w:asciiTheme="majorHAnsi" w:eastAsiaTheme="majorEastAsia" w:hAnsiTheme="majorHAnsi" w:cstheme="majorBidi"/>
+      <w:rFonts w:asciiTheme="majorHAnsi" w:hAnsiTheme="majorHAnsi" w:eastAsiaTheme="majorEastAsia" w:cstheme="majorBidi"/>
       <w:color w:val="0F4761" w:themeColor="accent1" w:themeShade="BF"/>
       <w:sz w:val="48"/>
       <w:szCs w:val="48"/>
@@ -701,7 +698,7 @@
       <w:outlineLvl w:val="1"/>
     </w:pPr>
     <w:rPr>
-      <w:rFonts w:asciiTheme="majorHAnsi" w:eastAsiaTheme="majorEastAsia" w:hAnsiTheme="majorHAnsi" w:cstheme="majorBidi"/>
+      <w:rFonts w:asciiTheme="majorHAnsi" w:hAnsiTheme="majorHAnsi" w:eastAsiaTheme="majorEastAsia" w:cstheme="majorBidi"/>
       <w:color w:val="0F4761" w:themeColor="accent1" w:themeShade="BF"/>
       <w:sz w:val="40"/>
       <w:szCs w:val="40"/>
@@ -724,7 +721,7 @@
       <w:outlineLvl w:val="2"/>
     </w:pPr>
     <w:rPr>
-      <w:rFonts w:asciiTheme="majorHAnsi" w:eastAsiaTheme="majorEastAsia" w:hAnsiTheme="majorHAnsi" w:cstheme="majorBidi"/>
+      <w:rFonts w:asciiTheme="majorHAnsi" w:hAnsiTheme="majorHAnsi" w:eastAsiaTheme="majorEastAsia" w:cstheme="majorBidi"/>
       <w:color w:val="0F4761" w:themeColor="accent1" w:themeShade="BF"/>
       <w:sz w:val="32"/>
       <w:szCs w:val="32"/>
@@ -863,12 +860,12 @@
       <w:color w:val="595959" w:themeColor="text1" w:themeTint="A6"/>
     </w:rPr>
   </w:style>
-  <w:style w:type="character" w:default="1" w:styleId="a0">
+  <w:style w:type="character" w:styleId="a0" w:default="1">
     <w:name w:val="Default Paragraph Font"/>
     <w:uiPriority w:val="1"/>
     <w:unhideWhenUsed/>
   </w:style>
-  <w:style w:type="table" w:default="1" w:styleId="a1">
+  <w:style w:type="table" w:styleId="a1" w:default="1">
     <w:name w:val="Normal Table"/>
     <w:uiPriority w:val="99"/>
     <w:semiHidden/>
@@ -883,26 +880,26 @@
       </w:tblCellMar>
     </w:tblPr>
   </w:style>
-  <w:style w:type="numbering" w:default="1" w:styleId="a2">
+  <w:style w:type="numbering" w:styleId="a2" w:default="1">
     <w:name w:val="No List"/>
     <w:uiPriority w:val="99"/>
     <w:semiHidden/>
     <w:unhideWhenUsed/>
   </w:style>
-  <w:style w:type="character" w:customStyle="1" w:styleId="10">
+  <w:style w:type="character" w:styleId="10" w:customStyle="1">
     <w:name w:val="标题 1 字符"/>
     <w:basedOn w:val="a0"/>
     <w:link w:val="1"/>
     <w:uiPriority w:val="9"/>
     <w:rsid w:val="00D00964"/>
     <w:rPr>
-      <w:rFonts w:asciiTheme="majorHAnsi" w:eastAsiaTheme="majorEastAsia" w:hAnsiTheme="majorHAnsi" w:cstheme="majorBidi"/>
+      <w:rFonts w:asciiTheme="majorHAnsi" w:hAnsiTheme="majorHAnsi" w:eastAsiaTheme="majorEastAsia" w:cstheme="majorBidi"/>
       <w:color w:val="0F4761" w:themeColor="accent1" w:themeShade="BF"/>
       <w:sz w:val="48"/>
       <w:szCs w:val="48"/>
     </w:rPr>
   </w:style>
-  <w:style w:type="character" w:customStyle="1" w:styleId="20">
+  <w:style w:type="character" w:styleId="20" w:customStyle="1">
     <w:name w:val="标题 2 字符"/>
     <w:basedOn w:val="a0"/>
     <w:link w:val="2"/>
@@ -910,13 +907,13 @@
     <w:semiHidden/>
     <w:rsid w:val="00D00964"/>
     <w:rPr>
-      <w:rFonts w:asciiTheme="majorHAnsi" w:eastAsiaTheme="majorEastAsia" w:hAnsiTheme="majorHAnsi" w:cstheme="majorBidi"/>
+      <w:rFonts w:asciiTheme="majorHAnsi" w:hAnsiTheme="majorHAnsi" w:eastAsiaTheme="majorEastAsia" w:cstheme="majorBidi"/>
       <w:color w:val="0F4761" w:themeColor="accent1" w:themeShade="BF"/>
       <w:sz w:val="40"/>
       <w:szCs w:val="40"/>
     </w:rPr>
   </w:style>
-  <w:style w:type="character" w:customStyle="1" w:styleId="30">
+  <w:style w:type="character" w:styleId="30" w:customStyle="1">
     <w:name w:val="标题 3 字符"/>
     <w:basedOn w:val="a0"/>
     <w:link w:val="3"/>
@@ -924,13 +921,13 @@
     <w:semiHidden/>
     <w:rsid w:val="00D00964"/>
     <w:rPr>
-      <w:rFonts w:asciiTheme="majorHAnsi" w:eastAsiaTheme="majorEastAsia" w:hAnsiTheme="majorHAnsi" w:cstheme="majorBidi"/>
+      <w:rFonts w:asciiTheme="majorHAnsi" w:hAnsiTheme="majorHAnsi" w:eastAsiaTheme="majorEastAsia" w:cstheme="majorBidi"/>
       <w:color w:val="0F4761" w:themeColor="accent1" w:themeShade="BF"/>
       <w:sz w:val="32"/>
       <w:szCs w:val="32"/>
     </w:rPr>
   </w:style>
-  <w:style w:type="character" w:customStyle="1" w:styleId="40">
+  <w:style w:type="character" w:styleId="40" w:customStyle="1">
     <w:name w:val="标题 4 字符"/>
     <w:basedOn w:val="a0"/>
     <w:link w:val="4"/>
@@ -944,7 +941,7 @@
       <w:szCs w:val="28"/>
     </w:rPr>
   </w:style>
-  <w:style w:type="character" w:customStyle="1" w:styleId="50">
+  <w:style w:type="character" w:styleId="50" w:customStyle="1">
     <w:name w:val="标题 5 字符"/>
     <w:basedOn w:val="a0"/>
     <w:link w:val="5"/>
@@ -957,7 +954,7 @@
       <w:sz w:val="24"/>
     </w:rPr>
   </w:style>
-  <w:style w:type="character" w:customStyle="1" w:styleId="60">
+  <w:style w:type="character" w:styleId="60" w:customStyle="1">
     <w:name w:val="标题 6 字符"/>
     <w:basedOn w:val="a0"/>
     <w:link w:val="6"/>
@@ -971,7 +968,7 @@
       <w:color w:val="0F4761" w:themeColor="accent1" w:themeShade="BF"/>
     </w:rPr>
   </w:style>
-  <w:style w:type="character" w:customStyle="1" w:styleId="70">
+  <w:style w:type="character" w:styleId="70" w:customStyle="1">
     <w:name w:val="标题 7 字符"/>
     <w:basedOn w:val="a0"/>
     <w:link w:val="7"/>
@@ -985,7 +982,7 @@
       <w:color w:val="595959" w:themeColor="text1" w:themeTint="A6"/>
     </w:rPr>
   </w:style>
-  <w:style w:type="character" w:customStyle="1" w:styleId="80">
+  <w:style w:type="character" w:styleId="80" w:customStyle="1">
     <w:name w:val="标题 8 字符"/>
     <w:basedOn w:val="a0"/>
     <w:link w:val="8"/>
@@ -997,7 +994,7 @@
       <w:color w:val="595959" w:themeColor="text1" w:themeTint="A6"/>
     </w:rPr>
   </w:style>
-  <w:style w:type="character" w:customStyle="1" w:styleId="90">
+  <w:style w:type="character" w:styleId="90" w:customStyle="1">
     <w:name w:val="标题 9 字符"/>
     <w:basedOn w:val="a0"/>
     <w:link w:val="9"/>
@@ -1023,21 +1020,21 @@
       <w:jc w:val="center"/>
     </w:pPr>
     <w:rPr>
-      <w:rFonts w:asciiTheme="majorHAnsi" w:eastAsiaTheme="majorEastAsia" w:hAnsiTheme="majorHAnsi" w:cstheme="majorBidi"/>
+      <w:rFonts w:asciiTheme="majorHAnsi" w:hAnsiTheme="majorHAnsi" w:eastAsiaTheme="majorEastAsia" w:cstheme="majorBidi"/>
       <w:spacing w:val="-10"/>
       <w:kern w:val="28"/>
       <w:sz w:val="56"/>
       <w:szCs w:val="56"/>
     </w:rPr>
   </w:style>
-  <w:style w:type="character" w:customStyle="1" w:styleId="a4">
+  <w:style w:type="character" w:styleId="a4" w:customStyle="1">
     <w:name w:val="标题 字符"/>
     <w:basedOn w:val="a0"/>
     <w:link w:val="a3"/>
     <w:uiPriority w:val="10"/>
     <w:rsid w:val="00D00964"/>
     <w:rPr>
-      <w:rFonts w:asciiTheme="majorHAnsi" w:eastAsiaTheme="majorEastAsia" w:hAnsiTheme="majorHAnsi" w:cstheme="majorBidi"/>
+      <w:rFonts w:asciiTheme="majorHAnsi" w:hAnsiTheme="majorHAnsi" w:eastAsiaTheme="majorEastAsia" w:cstheme="majorBidi"/>
       <w:spacing w:val="-10"/>
       <w:kern w:val="28"/>
       <w:sz w:val="56"/>
@@ -1059,21 +1056,21 @@
       <w:jc w:val="center"/>
     </w:pPr>
     <w:rPr>
-      <w:rFonts w:asciiTheme="majorHAnsi" w:eastAsiaTheme="majorEastAsia" w:hAnsiTheme="majorHAnsi" w:cstheme="majorBidi"/>
+      <w:rFonts w:asciiTheme="majorHAnsi" w:hAnsiTheme="majorHAnsi" w:eastAsiaTheme="majorEastAsia" w:cstheme="majorBidi"/>
       <w:color w:val="595959" w:themeColor="text1" w:themeTint="A6"/>
       <w:spacing w:val="15"/>
       <w:sz w:val="28"/>
       <w:szCs w:val="28"/>
     </w:rPr>
   </w:style>
-  <w:style w:type="character" w:customStyle="1" w:styleId="a6">
+  <w:style w:type="character" w:styleId="a6" w:customStyle="1">
     <w:name w:val="副标题 字符"/>
     <w:basedOn w:val="a0"/>
     <w:link w:val="a5"/>
     <w:uiPriority w:val="11"/>
     <w:rsid w:val="00D00964"/>
     <w:rPr>
-      <w:rFonts w:asciiTheme="majorHAnsi" w:eastAsiaTheme="majorEastAsia" w:hAnsiTheme="majorHAnsi" w:cstheme="majorBidi"/>
+      <w:rFonts w:asciiTheme="majorHAnsi" w:hAnsiTheme="majorHAnsi" w:eastAsiaTheme="majorEastAsia" w:cstheme="majorBidi"/>
       <w:color w:val="595959" w:themeColor="text1" w:themeTint="A6"/>
       <w:spacing w:val="15"/>
       <w:sz w:val="28"/>
@@ -1098,7 +1095,7 @@
       <w:color w:val="404040" w:themeColor="text1" w:themeTint="BF"/>
     </w:rPr>
   </w:style>
-  <w:style w:type="character" w:customStyle="1" w:styleId="a8">
+  <w:style w:type="character" w:styleId="a8" w:customStyle="1">
     <w:name w:val="引用 字符"/>
     <w:basedOn w:val="a0"/>
     <w:link w:val="a7"/>
@@ -1143,8 +1140,8 @@
     <w:rsid w:val="00D00964"/>
     <w:pPr>
       <w:pBdr>
-        <w:top w:val="single" w:sz="4" w:space="10" w:color="0F4761" w:themeColor="accent1" w:themeShade="BF"/>
-        <w:bottom w:val="single" w:sz="4" w:space="10" w:color="0F4761" w:themeColor="accent1" w:themeShade="BF"/>
+        <w:top w:val="single" w:color="0F4761" w:themeColor="accent1" w:themeShade="BF" w:sz="4" w:space="10"/>
+        <w:bottom w:val="single" w:color="0F4761" w:themeColor="accent1" w:themeShade="BF" w:sz="4" w:space="10"/>
       </w:pBdr>
       <w:spacing w:before="360" w:after="360"/>
       <w:ind w:left="864" w:right="864"/>
@@ -1156,7 +1153,7 @@
       <w:color w:val="0F4761" w:themeColor="accent1" w:themeShade="BF"/>
     </w:rPr>
   </w:style>
-  <w:style w:type="character" w:customStyle="1" w:styleId="ac">
+  <w:style w:type="character" w:styleId="ac" w:customStyle="1">
     <w:name w:val="明显引用 字符"/>
     <w:basedOn w:val="a0"/>
     <w:link w:val="ab"/>
@@ -1186,7 +1183,7 @@
 </file>
 
 <file path=word/theme/theme1.xml><?xml version="1.0" encoding="utf-8"?>
-<a:theme xmlns:a="http://schemas.openxmlformats.org/drawingml/2006/main" name="Office 主题​​">
+<a:theme xmlns:a="http://schemas.openxmlformats.org/drawingml/2006/main" xmlns:thm15="http://schemas.microsoft.com/office/thememl/2012/main" name="Office 主题​​">
   <a:themeElements>
     <a:clrScheme name="Office">
       <a:dk1>

</xml_diff>